<commit_message>
Save progress to update.
</commit_message>
<xml_diff>
--- a/Rearranged_Lectures/Appendix--Labs/Lab1_App_Service_wo_Docker/App_Service_WebSite_Lab.docx
+++ b/Rearranged_Lectures/Appendix--Labs/Lab1_App_Service_wo_Docker/App_Service_WebSite_Lab.docx
@@ -1694,63 +1694,13 @@
       <w:pPr>
         <w:pStyle w:val="Heading1"/>
       </w:pPr>
-      <w:bookmarkStart w:id="8" w:name="_Toc237733297"/>
       <w:r>
         <w:lastRenderedPageBreak/>
-        <w:t>Installing Local Resources</w:t>
-      </w:r>
-      <w:bookmarkEnd w:id="8"/>
-    </w:p>
-    <w:p>
-      <w:pPr>
-        <w:pStyle w:val="ListParagraph"/>
-        <w:numPr>
-          <w:ilvl w:val="0"/>
-          <w:numId w:val="3"/>
-        </w:numPr>
-        <w:outlineLvl w:val="1"/>
-        <w:rPr>
-          <w:highlight w:val="yellow"/>
-        </w:rPr>
-      </w:pPr>
-      <w:bookmarkStart w:id="9" w:name="_Toc237733298"/>
-      <w:r>
-        <w:rPr>
-          <w:highlight w:val="yellow"/>
-        </w:rPr>
-        <w:t>Install Visual Studio</w:t>
-      </w:r>
-      <w:bookmarkEnd w:id="9"/>
-    </w:p>
-    <w:p>
-      <w:pPr>
-        <w:pStyle w:val="ListParagraph"/>
-        <w:numPr>
-          <w:ilvl w:val="1"/>
-          <w:numId w:val="3"/>
-        </w:numPr>
-        <w:rPr>
-          <w:highlight w:val="yellow"/>
-        </w:rPr>
-      </w:pPr>
-      <w:hyperlink r:id="rId10">
-        <w:r>
-          <w:rPr>
-            <w:rStyle w:val="Hyperlink"/>
-            <w:highlight w:val="yellow"/>
-          </w:rPr>
-          <w:t>https://visualstudio.microsoft.com/downloads/</w:t>
-        </w:r>
-      </w:hyperlink>
-    </w:p>
-    <w:p>
-      <w:pPr>
-        <w:pStyle w:val="ListParagraph"/>
-        <w:numPr>
-          <w:ilvl w:val="1"/>
-          <w:numId w:val="3"/>
-        </w:numPr>
-      </w:pPr>
+        <w:t xml:space="preserve">Visual Studio </w:t>
+      </w:r>
+      <w:r>
+        <w:t>Setup MVC Website</w:t>
+      </w:r>
     </w:p>
     <w:p>
       <w:pPr>
@@ -1774,28 +1724,273 @@
         </w:rPr>
         <w:t>Project Selection/Creation Dialog Window</w:t>
       </w:r>
-    </w:p>
-    <w:p>
-      <w:pPr>
-        <w:pStyle w:val="NormalWeb"/>
-        <w:numPr>
-          <w:ilvl w:val="1"/>
-          <w:numId w:val="3"/>
-        </w:numPr>
-        <w:spacing w:after="280"/>
+      <w:r>
         <w:rPr>
           <w:rFonts w:asciiTheme="minorHAnsi" w:eastAsiaTheme="minorHAnsi" w:hAnsiTheme="minorHAnsi" w:cstheme="minorBidi"/>
           <w:kern w:val="2"/>
           <w14:ligatures w14:val="standardContextual"/>
         </w:rPr>
-      </w:pPr>
-      <w:r>
+        <w:t xml:space="preserve"> Startup scenarios</w:t>
+      </w:r>
+    </w:p>
+    <w:p>
+      <w:pPr>
+        <w:pStyle w:val="NormalWeb"/>
+        <w:numPr>
+          <w:ilvl w:val="1"/>
+          <w:numId w:val="3"/>
+        </w:numPr>
+        <w:spacing w:after="280"/>
         <w:rPr>
           <w:rFonts w:asciiTheme="minorHAnsi" w:eastAsiaTheme="minorHAnsi" w:hAnsiTheme="minorHAnsi" w:cstheme="minorBidi"/>
           <w:kern w:val="2"/>
           <w14:ligatures w14:val="standardContextual"/>
         </w:rPr>
-        <w:t>Before Visual Studio shows, it launches the project selection/creation dialog window.  You can bypass this window to get to the full window via the button on the bottom right.  The catch is that you will face this dialog window again when you decide to create a project.</w:t>
+      </w:pPr>
+      <w:r>
+        <w:rPr>
+          <w:rFonts w:asciiTheme="minorHAnsi" w:eastAsiaTheme="minorHAnsi" w:hAnsiTheme="minorHAnsi" w:cstheme="minorBidi"/>
+          <w:kern w:val="2"/>
+          <w14:ligatures w14:val="standardContextual"/>
+        </w:rPr>
+        <w:t>After install</w:t>
+      </w:r>
+      <w:r>
+        <w:rPr>
+          <w:rFonts w:asciiTheme="minorHAnsi" w:eastAsiaTheme="minorHAnsi" w:hAnsiTheme="minorHAnsi" w:cstheme="minorBidi"/>
+          <w:kern w:val="2"/>
+          <w14:ligatures w14:val="standardContextual"/>
+        </w:rPr>
+        <w:t>er</w:t>
+      </w:r>
+      <w:r>
+        <w:rPr>
+          <w:rFonts w:asciiTheme="minorHAnsi" w:eastAsiaTheme="minorHAnsi" w:hAnsiTheme="minorHAnsi" w:cstheme="minorBidi"/>
+          <w:kern w:val="2"/>
+          <w14:ligatures w14:val="standardContextual"/>
+        </w:rPr>
+        <w:t xml:space="preserve"> completes, and b</w:t>
+      </w:r>
+      <w:r>
+        <w:rPr>
+          <w:rFonts w:asciiTheme="minorHAnsi" w:eastAsiaTheme="minorHAnsi" w:hAnsiTheme="minorHAnsi" w:cstheme="minorBidi"/>
+          <w:kern w:val="2"/>
+          <w14:ligatures w14:val="standardContextual"/>
+        </w:rPr>
+        <w:t xml:space="preserve">efore Visual Studio shows, it launches the project selection/creation dialog window.  </w:t>
+      </w:r>
+    </w:p>
+    <w:p>
+      <w:pPr>
+        <w:pStyle w:val="NormalWeb"/>
+        <w:numPr>
+          <w:ilvl w:val="1"/>
+          <w:numId w:val="3"/>
+        </w:numPr>
+        <w:spacing w:after="280"/>
+        <w:rPr>
+          <w:rFonts w:asciiTheme="minorHAnsi" w:eastAsiaTheme="minorHAnsi" w:hAnsiTheme="minorHAnsi" w:cstheme="minorBidi"/>
+          <w:kern w:val="2"/>
+          <w14:ligatures w14:val="standardContextual"/>
+        </w:rPr>
+      </w:pPr>
+      <w:r>
+        <w:rPr>
+          <w:rFonts w:asciiTheme="minorHAnsi" w:eastAsiaTheme="minorHAnsi" w:hAnsiTheme="minorHAnsi" w:cstheme="minorBidi"/>
+          <w:kern w:val="2"/>
+          <w14:ligatures w14:val="standardContextual"/>
+        </w:rPr>
+        <w:t>Start Visual Studio and create a project</w:t>
+      </w:r>
+    </w:p>
+    <w:p>
+      <w:pPr>
+        <w:pStyle w:val="NormalWeb"/>
+        <w:numPr>
+          <w:ilvl w:val="2"/>
+          <w:numId w:val="3"/>
+        </w:numPr>
+        <w:spacing w:after="280"/>
+        <w:rPr>
+          <w:rFonts w:asciiTheme="minorHAnsi" w:eastAsiaTheme="minorHAnsi" w:hAnsiTheme="minorHAnsi" w:cstheme="minorBidi"/>
+          <w:kern w:val="2"/>
+          <w14:ligatures w14:val="standardContextual"/>
+        </w:rPr>
+      </w:pPr>
+      <w:r>
+        <w:rPr>
+          <w:rFonts w:asciiTheme="minorHAnsi" w:eastAsiaTheme="minorHAnsi" w:hAnsiTheme="minorHAnsi" w:cstheme="minorBidi"/>
+          <w:kern w:val="2"/>
+          <w14:ligatures w14:val="standardContextual"/>
+        </w:rPr>
+        <w:t>Double click on Visual Studio</w:t>
+      </w:r>
+    </w:p>
+    <w:p>
+      <w:pPr>
+        <w:pStyle w:val="NormalWeb"/>
+        <w:numPr>
+          <w:ilvl w:val="2"/>
+          <w:numId w:val="3"/>
+        </w:numPr>
+        <w:spacing w:after="280"/>
+        <w:rPr>
+          <w:rFonts w:asciiTheme="minorHAnsi" w:eastAsiaTheme="minorHAnsi" w:hAnsiTheme="minorHAnsi" w:cstheme="minorBidi"/>
+          <w:kern w:val="2"/>
+          <w14:ligatures w14:val="standardContextual"/>
+        </w:rPr>
+      </w:pPr>
+      <w:r>
+        <w:rPr>
+          <w:rFonts w:asciiTheme="minorHAnsi" w:eastAsiaTheme="minorHAnsi" w:hAnsiTheme="minorHAnsi" w:cstheme="minorBidi"/>
+          <w:kern w:val="2"/>
+          <w14:ligatures w14:val="standardContextual"/>
+        </w:rPr>
+        <w:t>Dialog shows</w:t>
+      </w:r>
+    </w:p>
+    <w:p>
+      <w:pPr>
+        <w:pStyle w:val="NormalWeb"/>
+        <w:numPr>
+          <w:ilvl w:val="1"/>
+          <w:numId w:val="3"/>
+        </w:numPr>
+        <w:spacing w:after="280"/>
+        <w:rPr>
+          <w:rFonts w:asciiTheme="minorHAnsi" w:eastAsiaTheme="minorHAnsi" w:hAnsiTheme="minorHAnsi" w:cstheme="minorBidi"/>
+          <w:kern w:val="2"/>
+          <w14:ligatures w14:val="standardContextual"/>
+        </w:rPr>
+      </w:pPr>
+      <w:r>
+        <w:rPr>
+          <w:rFonts w:asciiTheme="minorHAnsi" w:eastAsiaTheme="minorHAnsi" w:hAnsiTheme="minorHAnsi" w:cstheme="minorBidi"/>
+          <w:kern w:val="2"/>
+          <w14:ligatures w14:val="standardContextual"/>
+        </w:rPr>
+        <w:t>Visual Studio is running without project window showing</w:t>
+      </w:r>
+    </w:p>
+    <w:p>
+      <w:pPr>
+        <w:pStyle w:val="NormalWeb"/>
+        <w:numPr>
+          <w:ilvl w:val="2"/>
+          <w:numId w:val="3"/>
+        </w:numPr>
+        <w:spacing w:after="280"/>
+        <w:rPr>
+          <w:rFonts w:asciiTheme="minorHAnsi" w:eastAsiaTheme="minorHAnsi" w:hAnsiTheme="minorHAnsi" w:cstheme="minorBidi"/>
+          <w:kern w:val="2"/>
+          <w14:ligatures w14:val="standardContextual"/>
+        </w:rPr>
+      </w:pPr>
+      <w:r>
+        <w:rPr>
+          <w:rFonts w:asciiTheme="minorHAnsi" w:eastAsiaTheme="minorHAnsi" w:hAnsiTheme="minorHAnsi" w:cstheme="minorBidi"/>
+          <w:kern w:val="2"/>
+          <w14:ligatures w14:val="standardContextual"/>
+        </w:rPr>
+        <w:t>File menu-&gt;</w:t>
+      </w:r>
+    </w:p>
+    <w:p>
+      <w:pPr>
+        <w:pStyle w:val="NormalWeb"/>
+        <w:numPr>
+          <w:ilvl w:val="3"/>
+          <w:numId w:val="3"/>
+        </w:numPr>
+        <w:spacing w:after="280"/>
+        <w:rPr>
+          <w:rFonts w:asciiTheme="minorHAnsi" w:eastAsiaTheme="minorHAnsi" w:hAnsiTheme="minorHAnsi" w:cstheme="minorBidi"/>
+          <w:kern w:val="2"/>
+          <w14:ligatures w14:val="standardContextual"/>
+        </w:rPr>
+      </w:pPr>
+      <w:r>
+        <w:rPr>
+          <w:rFonts w:asciiTheme="minorHAnsi" w:eastAsiaTheme="minorHAnsi" w:hAnsiTheme="minorHAnsi" w:cstheme="minorBidi"/>
+          <w:kern w:val="2"/>
+          <w14:ligatures w14:val="standardContextual"/>
+        </w:rPr>
+        <w:drawing>
+          <wp:inline distT="0" distB="0" distL="0" distR="0" wp14:anchorId="3712AAD7" wp14:editId="246A2F69">
+            <wp:extent cx="5943600" cy="921385"/>
+            <wp:effectExtent l="0" t="0" r="0" b="0"/>
+            <wp:docPr id="1246184110" name="Picture 1"/>
+            <wp:cNvGraphicFramePr>
+              <a:graphicFrameLocks xmlns:a="http://schemas.openxmlformats.org/drawingml/2006/main" noChangeAspect="1"/>
+            </wp:cNvGraphicFramePr>
+            <a:graphic xmlns:a="http://schemas.openxmlformats.org/drawingml/2006/main">
+              <a:graphicData uri="http://schemas.openxmlformats.org/drawingml/2006/picture">
+                <pic:pic xmlns:pic="http://schemas.openxmlformats.org/drawingml/2006/picture">
+                  <pic:nvPicPr>
+                    <pic:cNvPr id="1246184110" name=""/>
+                    <pic:cNvPicPr/>
+                  </pic:nvPicPr>
+                  <pic:blipFill>
+                    <a:blip r:embed="rId10"/>
+                    <a:stretch>
+                      <a:fillRect/>
+                    </a:stretch>
+                  </pic:blipFill>
+                  <pic:spPr>
+                    <a:xfrm>
+                      <a:off x="0" y="0"/>
+                      <a:ext cx="5943600" cy="921385"/>
+                    </a:xfrm>
+                    <a:prstGeom prst="rect">
+                      <a:avLst/>
+                    </a:prstGeom>
+                  </pic:spPr>
+                </pic:pic>
+              </a:graphicData>
+            </a:graphic>
+          </wp:inline>
+        </w:drawing>
+      </w:r>
+    </w:p>
+    <w:p>
+      <w:pPr>
+        <w:pStyle w:val="NormalWeb"/>
+        <w:numPr>
+          <w:ilvl w:val="2"/>
+          <w:numId w:val="3"/>
+        </w:numPr>
+        <w:spacing w:after="280"/>
+        <w:rPr>
+          <w:rFonts w:asciiTheme="minorHAnsi" w:eastAsiaTheme="minorHAnsi" w:hAnsiTheme="minorHAnsi" w:cstheme="minorBidi"/>
+          <w:kern w:val="2"/>
+          <w14:ligatures w14:val="standardContextual"/>
+        </w:rPr>
+      </w:pPr>
+      <w:r>
+        <w:rPr>
+          <w:rFonts w:asciiTheme="minorHAnsi" w:eastAsiaTheme="minorHAnsi" w:hAnsiTheme="minorHAnsi" w:cstheme="minorBidi"/>
+          <w:kern w:val="2"/>
+          <w14:ligatures w14:val="standardContextual"/>
+        </w:rPr>
+        <w:t xml:space="preserve">Project history and </w:t>
+      </w:r>
+      <w:proofErr w:type="gramStart"/>
+      <w:r>
+        <w:rPr>
+          <w:rFonts w:asciiTheme="minorHAnsi" w:eastAsiaTheme="minorHAnsi" w:hAnsiTheme="minorHAnsi" w:cstheme="minorBidi"/>
+          <w:kern w:val="2"/>
+          <w14:ligatures w14:val="standardContextual"/>
+        </w:rPr>
+        <w:t>high level</w:t>
+      </w:r>
+      <w:proofErr w:type="gramEnd"/>
+      <w:r>
+        <w:rPr>
+          <w:rFonts w:asciiTheme="minorHAnsi" w:eastAsiaTheme="minorHAnsi" w:hAnsiTheme="minorHAnsi" w:cstheme="minorBidi"/>
+          <w:kern w:val="2"/>
+          <w14:ligatures w14:val="standardContextual"/>
+        </w:rPr>
+        <w:t xml:space="preserve"> dialog decisions dialog</w:t>
       </w:r>
     </w:p>
     <w:p>
@@ -1910,35 +2105,19 @@
         <w:rPr>
           <w:b/>
           <w:bCs/>
-        </w:rPr>
-        <w:t>C#”</w:t>
-      </w:r>
-      <w:r>
-        <w:t xml:space="preserve"> as shown by marked item 2 on graphic</w:t>
-      </w:r>
-    </w:p>
-    <w:p>
-      <w:pPr>
-        <w:pStyle w:val="ListParagraph"/>
-        <w:numPr>
-          <w:ilvl w:val="2"/>
-          <w:numId w:val="1"/>
-        </w:numPr>
-      </w:pPr>
-      <w:r>
-        <w:t>Type text “</w:t>
-      </w:r>
-      <w:proofErr w:type="spellStart"/>
+          <w:color w:val="EE0000"/>
+        </w:rPr>
+        <w:t>C#</w:t>
+      </w:r>
       <w:r>
         <w:rPr>
           <w:b/>
           <w:bCs/>
         </w:rPr>
-        <w:t>mvc</w:t>
-      </w:r>
-      <w:proofErr w:type="spellEnd"/>
-      <w:r>
-        <w:t>” as shown by item 1 on graphic</w:t>
+        <w:t>”</w:t>
+      </w:r>
+      <w:r>
+        <w:t xml:space="preserve"> as shown by marked item 2 on graphic</w:t>
       </w:r>
     </w:p>
     <w:p>
@@ -1950,12 +2129,39 @@
         </w:numPr>
       </w:pPr>
       <w:r>
-        <w:t>Click on the option box that says “</w:t>
-      </w:r>
+        <w:lastRenderedPageBreak/>
+        <w:t>Type text “</w:t>
+      </w:r>
+      <w:proofErr w:type="spellStart"/>
       <w:r>
         <w:rPr>
           <w:b/>
           <w:bCs/>
+          <w:color w:val="EE0000"/>
+        </w:rPr>
+        <w:t>mvc</w:t>
+      </w:r>
+      <w:proofErr w:type="spellEnd"/>
+      <w:r>
+        <w:t>” as shown by item 1 on graphic</w:t>
+      </w:r>
+    </w:p>
+    <w:p>
+      <w:pPr>
+        <w:pStyle w:val="ListParagraph"/>
+        <w:numPr>
+          <w:ilvl w:val="2"/>
+          <w:numId w:val="1"/>
+        </w:numPr>
+      </w:pPr>
+      <w:r>
+        <w:t>Click on the option box that says “</w:t>
+      </w:r>
+      <w:r>
+        <w:rPr>
+          <w:b/>
+          <w:bCs/>
+          <w:color w:val="EE0000"/>
         </w:rPr>
         <w:t>ASP.NET Core</w:t>
       </w:r>
@@ -1972,7 +2178,14 @@
         </w:numPr>
       </w:pPr>
       <w:r>
-        <w:t>ASP.NET Core vs ASP.NET .Net Framework</w:t>
+        <w:rPr>
+          <w:b/>
+          <w:bCs/>
+        </w:rPr>
+        <w:t>ASP.NET Core</w:t>
+      </w:r>
+      <w:r>
+        <w:t xml:space="preserve"> vs ASP.NET .Net Framework</w:t>
       </w:r>
     </w:p>
     <w:p>
@@ -1984,26 +2197,291 @@
         </w:numPr>
       </w:pPr>
       <w:r>
+        <w:t xml:space="preserve">There are many differences, but for our purposes, </w:t>
+      </w:r>
+      <w:r>
+        <w:rPr>
+          <w:highlight w:val="green"/>
+        </w:rPr>
+        <w:t>Core works in Linux and Windows</w:t>
+      </w:r>
+      <w:r>
+        <w:t xml:space="preserve">, but </w:t>
+      </w:r>
+      <w:r>
+        <w:rPr>
+          <w:highlight w:val="lightGray"/>
+        </w:rPr>
+        <w:t>.Net Framework only works in Windows</w:t>
+      </w:r>
+      <w:r>
+        <w:rPr>
+          <w:highlight w:val="lightGray"/>
+        </w:rPr>
+        <w:t xml:space="preserve"> using Internet Information Server (IIS)</w:t>
+      </w:r>
+      <w:r>
+        <w:t>.</w:t>
+      </w:r>
+    </w:p>
+    <w:p>
+      <w:pPr>
+        <w:pStyle w:val="ListParagraph"/>
+        <w:numPr>
+          <w:ilvl w:val="2"/>
+          <w:numId w:val="1"/>
+        </w:numPr>
+      </w:pPr>
+      <w:r>
+        <w:t>Project type selection dialog</w:t>
+      </w:r>
+    </w:p>
+    <w:p>
+      <w:pPr>
+        <w:pStyle w:val="ListParagraph"/>
+        <w:numPr>
+          <w:ilvl w:val="3"/>
+          <w:numId w:val="1"/>
+        </w:numPr>
+      </w:pPr>
+      <w:r>
+        <w:t xml:space="preserve">This dialog is all about helping you choose which project you want.  It provides a recent history </w:t>
+      </w:r>
+      <w:proofErr w:type="gramStart"/>
+      <w:r>
+        <w:t>at</w:t>
+      </w:r>
+      <w:proofErr w:type="gramEnd"/>
+      <w:r>
+        <w:t xml:space="preserve"> the left to help you repeat previous projects.</w:t>
+      </w:r>
+    </w:p>
+    <w:p>
+      <w:pPr>
+        <w:pStyle w:val="ListParagraph"/>
+        <w:ind w:left="2160"/>
+      </w:pPr>
+      <w:r>
+        <w:drawing>
+          <wp:anchor distT="0" distB="0" distL="114300" distR="114300" simplePos="0" relativeHeight="251658240" behindDoc="0" locked="0" layoutInCell="1" allowOverlap="1" wp14:anchorId="45F9AB33" wp14:editId="15C9F7ED">
+            <wp:simplePos x="0" y="0"/>
+            <wp:positionH relativeFrom="column">
+              <wp:posOffset>914400</wp:posOffset>
+            </wp:positionH>
+            <wp:positionV relativeFrom="paragraph">
+              <wp:posOffset>3810</wp:posOffset>
+            </wp:positionV>
+            <wp:extent cx="5943600" cy="3825875"/>
+            <wp:effectExtent l="0" t="0" r="0" b="3175"/>
+            <wp:wrapTopAndBottom/>
+            <wp:docPr id="2016718391" name="Picture 1"/>
+            <wp:cNvGraphicFramePr>
+              <a:graphicFrameLocks xmlns:a="http://schemas.openxmlformats.org/drawingml/2006/main" noChangeAspect="1"/>
+            </wp:cNvGraphicFramePr>
+            <a:graphic xmlns:a="http://schemas.openxmlformats.org/drawingml/2006/main">
+              <a:graphicData uri="http://schemas.openxmlformats.org/drawingml/2006/picture">
+                <pic:pic xmlns:pic="http://schemas.openxmlformats.org/drawingml/2006/picture">
+                  <pic:nvPicPr>
+                    <pic:cNvPr id="2016718391" name=""/>
+                    <pic:cNvPicPr/>
+                  </pic:nvPicPr>
+                  <pic:blipFill>
+                    <a:blip r:embed="rId12">
+                      <a:extLst>
+                        <a:ext uri="{28A0092B-C50C-407E-A947-70E740481C1C}">
+                          <a14:useLocalDpi xmlns:a14="http://schemas.microsoft.com/office/drawing/2010/main" val="0"/>
+                        </a:ext>
+                      </a:extLst>
+                    </a:blip>
+                    <a:stretch>
+                      <a:fillRect/>
+                    </a:stretch>
+                  </pic:blipFill>
+                  <pic:spPr>
+                    <a:xfrm>
+                      <a:off x="0" y="0"/>
+                      <a:ext cx="5943600" cy="3825875"/>
+                    </a:xfrm>
+                    <a:prstGeom prst="rect">
+                      <a:avLst/>
+                    </a:prstGeom>
+                  </pic:spPr>
+                </pic:pic>
+              </a:graphicData>
+            </a:graphic>
+          </wp:anchor>
+        </w:drawing>
+      </w:r>
+    </w:p>
+    <w:p>
+      <w:pPr>
+        <w:pStyle w:val="ListParagraph"/>
+        <w:ind w:left="2160"/>
+      </w:pPr>
+    </w:p>
+    <w:p>
+      <w:pPr>
+        <w:pStyle w:val="ListParagraph"/>
+        <w:ind w:left="2160"/>
+      </w:pPr>
+    </w:p>
+    <w:p>
+      <w:pPr>
+        <w:pStyle w:val="ListParagraph"/>
+        <w:ind w:left="2160"/>
+      </w:pPr>
+    </w:p>
+    <w:p>
+      <w:pPr>
+        <w:pStyle w:val="ListParagraph"/>
+        <w:ind w:left="2160"/>
+      </w:pPr>
+    </w:p>
+    <w:p>
+      <w:pPr>
+        <w:pStyle w:val="ListParagraph"/>
+        <w:ind w:left="2160"/>
+      </w:pPr>
+    </w:p>
+    <w:p>
+      <w:pPr>
+        <w:pStyle w:val="ListParagraph"/>
+        <w:ind w:left="2160"/>
+      </w:pPr>
+    </w:p>
+    <w:p>
+      <w:pPr>
+        <w:pStyle w:val="ListParagraph"/>
+        <w:ind w:left="2160"/>
+      </w:pPr>
+    </w:p>
+    <w:p>
+      <w:pPr>
+        <w:pStyle w:val="ListParagraph"/>
+        <w:ind w:left="2160"/>
+      </w:pPr>
+    </w:p>
+    <w:p>
+      <w:pPr>
+        <w:pStyle w:val="ListParagraph"/>
+        <w:numPr>
+          <w:ilvl w:val="2"/>
+          <w:numId w:val="1"/>
+        </w:numPr>
+      </w:pPr>
+      <w:r>
         <w:lastRenderedPageBreak/>
-        <w:t>There are many differences, but for our purposes, Core works in Linux and Windows, but .Net Framework only works in Windows.</w:t>
-      </w:r>
-    </w:p>
-    <w:p>
-      <w:pPr>
-        <w:pStyle w:val="ListParagraph"/>
-        <w:numPr>
-          <w:ilvl w:val="2"/>
-          <w:numId w:val="1"/>
-        </w:numPr>
-      </w:pPr>
-    </w:p>
-    <w:p>
-      <w:pPr>
-        <w:pStyle w:val="ListParagraph"/>
-        <w:numPr>
-          <w:ilvl w:val="1"/>
-          <w:numId w:val="1"/>
-        </w:numPr>
+        <w:t>Project Name and Location Dialog</w:t>
+      </w:r>
+    </w:p>
+    <w:p>
+      <w:pPr>
+        <w:pStyle w:val="ListParagraph"/>
+        <w:numPr>
+          <w:ilvl w:val="3"/>
+          <w:numId w:val="1"/>
+        </w:numPr>
+      </w:pPr>
+      <w:r>
+        <w:t>Type in project name</w:t>
+      </w:r>
+    </w:p>
+    <w:p>
+      <w:pPr>
+        <w:pStyle w:val="ListParagraph"/>
+        <w:numPr>
+          <w:ilvl w:val="3"/>
+          <w:numId w:val="1"/>
+        </w:numPr>
+      </w:pPr>
+      <w:r>
+        <w:t>Project location</w:t>
+      </w:r>
+    </w:p>
+    <w:p>
+      <w:pPr>
+        <w:pStyle w:val="ListParagraph"/>
+        <w:numPr>
+          <w:ilvl w:val="4"/>
+          <w:numId w:val="1"/>
+        </w:numPr>
+      </w:pPr>
+      <w:r>
+        <w:t>Dropdown of recent locations</w:t>
+      </w:r>
+    </w:p>
+    <w:p>
+      <w:pPr>
+        <w:pStyle w:val="ListParagraph"/>
+        <w:numPr>
+          <w:ilvl w:val="4"/>
+          <w:numId w:val="1"/>
+        </w:numPr>
+      </w:pPr>
+      <w:r>
+        <w:t>Click three dots to get folder selection dialog.</w:t>
+      </w:r>
+    </w:p>
+    <w:p>
+      <w:pPr>
+        <w:pStyle w:val="ListParagraph"/>
+        <w:numPr>
+          <w:ilvl w:val="3"/>
+          <w:numId w:val="1"/>
+        </w:numPr>
+      </w:pPr>
+      <w:r>
+        <w:t>Checkbox, “Place solution and project in the same directory</w:t>
+      </w:r>
+    </w:p>
+    <w:p>
+      <w:pPr>
+        <w:pStyle w:val="ListParagraph"/>
+        <w:numPr>
+          <w:ilvl w:val="4"/>
+          <w:numId w:val="1"/>
+        </w:numPr>
+      </w:pPr>
+      <w:r>
+        <w:t>When this</w:t>
+      </w:r>
+      <w:r>
+        <w:t xml:space="preserve"> checkbox</w:t>
+      </w:r>
+      <w:r>
+        <w:t xml:space="preserve"> is</w:t>
+      </w:r>
+      <w:r>
+        <w:t xml:space="preserve"> not</w:t>
+      </w:r>
+      <w:r>
+        <w:t xml:space="preserve"> </w:t>
+      </w:r>
+      <w:r>
+        <w:t>checked</w:t>
+      </w:r>
+      <w:r>
+        <w:t>,</w:t>
+      </w:r>
+      <w:r>
+        <w:t xml:space="preserve"> </w:t>
+      </w:r>
+      <w:r>
+        <w:t xml:space="preserve">you need to provide a separate name for the solution file that tracks </w:t>
+      </w:r>
+      <w:proofErr w:type="gramStart"/>
+      <w:r>
+        <w:t>all of</w:t>
+      </w:r>
+      <w:proofErr w:type="gramEnd"/>
+      <w:r>
+        <w:t xml:space="preserve"> the project files.</w:t>
+      </w:r>
+    </w:p>
+    <w:p>
+      <w:pPr>
+        <w:pStyle w:val="ListParagraph"/>
+        <w:ind w:left="1440"/>
       </w:pPr>
       <w:r>
         <w:rPr>
@@ -2035,7 +2513,7 @@
                     </pic:cNvPicPr>
                   </pic:nvPicPr>
                   <pic:blipFill>
-                    <a:blip r:embed="rId12"/>
+                    <a:blip r:embed="rId13"/>
                     <a:stretch>
                       <a:fillRect/>
                     </a:stretch>
@@ -2056,25 +2534,204 @@
           </wp:anchor>
         </w:drawing>
       </w:r>
+    </w:p>
+    <w:p>
+      <w:pPr>
+        <w:pStyle w:val="ListParagraph"/>
+        <w:ind w:left="1440"/>
+      </w:pPr>
+    </w:p>
+    <w:p>
+      <w:pPr>
+        <w:pStyle w:val="ListParagraph"/>
+        <w:ind w:left="1440"/>
+      </w:pPr>
+    </w:p>
+    <w:p>
+      <w:pPr>
+        <w:pStyle w:val="ListParagraph"/>
+        <w:ind w:left="1440"/>
+      </w:pPr>
+    </w:p>
+    <w:p>
+      <w:pPr>
+        <w:pStyle w:val="ListParagraph"/>
+        <w:ind w:left="1440"/>
+      </w:pPr>
+    </w:p>
+    <w:p>
+      <w:pPr>
+        <w:pStyle w:val="ListParagraph"/>
+        <w:ind w:left="1440"/>
+      </w:pPr>
+    </w:p>
+    <w:p>
+      <w:pPr>
+        <w:pStyle w:val="ListParagraph"/>
+        <w:ind w:left="1440"/>
+      </w:pPr>
+    </w:p>
+    <w:p>
+      <w:pPr>
+        <w:pStyle w:val="ListParagraph"/>
+        <w:ind w:left="1440"/>
+      </w:pPr>
+    </w:p>
+    <w:p>
+      <w:pPr>
+        <w:pStyle w:val="ListParagraph"/>
+        <w:ind w:left="1440"/>
+      </w:pPr>
+    </w:p>
+    <w:p>
+      <w:pPr>
+        <w:pStyle w:val="ListParagraph"/>
+        <w:ind w:left="1440"/>
+      </w:pPr>
+    </w:p>
+    <w:p>
+      <w:pPr>
+        <w:pStyle w:val="ListParagraph"/>
+        <w:ind w:left="1440"/>
+      </w:pPr>
+    </w:p>
+    <w:p>
+      <w:pPr>
+        <w:pStyle w:val="ListParagraph"/>
+        <w:ind w:left="1440"/>
+      </w:pPr>
+    </w:p>
+    <w:p>
+      <w:pPr>
+        <w:pStyle w:val="ListParagraph"/>
+        <w:numPr>
+          <w:ilvl w:val="1"/>
+          <w:numId w:val="1"/>
+        </w:numPr>
+      </w:pPr>
+      <w:r>
+        <w:t>New project settings</w:t>
+      </w:r>
+    </w:p>
+    <w:p>
+      <w:pPr>
+        <w:pStyle w:val="ListParagraph"/>
+        <w:numPr>
+          <w:ilvl w:val="2"/>
+          <w:numId w:val="1"/>
+        </w:numPr>
+      </w:pPr>
+      <w:r>
+        <w:t>Framework</w:t>
+      </w:r>
+    </w:p>
+    <w:p>
+      <w:pPr>
+        <w:pStyle w:val="ListParagraph"/>
+        <w:numPr>
+          <w:ilvl w:val="3"/>
+          <w:numId w:val="1"/>
+        </w:numPr>
+      </w:pPr>
+      <w:r>
+        <w:t>Multiple .Net versions can be installed at the same time.  Visual Studio installs with a Dotnet version.  Others can be installed after Visual Studio to support older projects.  Drop down shows all versions that are currently installed.</w:t>
+      </w:r>
+    </w:p>
+    <w:p>
+      <w:pPr>
+        <w:pStyle w:val="ListParagraph"/>
+        <w:numPr>
+          <w:ilvl w:val="2"/>
+          <w:numId w:val="1"/>
+        </w:numPr>
+      </w:pPr>
+      <w:r>
+        <w:t>Authentication type</w:t>
+      </w:r>
+    </w:p>
+    <w:p>
+      <w:pPr>
+        <w:pStyle w:val="ListParagraph"/>
+        <w:numPr>
+          <w:ilvl w:val="3"/>
+          <w:numId w:val="1"/>
+        </w:numPr>
+      </w:pPr>
+      <w:r>
+        <w:t>None (no login page included or needed)</w:t>
+      </w:r>
+    </w:p>
+    <w:p>
+      <w:pPr>
+        <w:pStyle w:val="ListParagraph"/>
+        <w:numPr>
+          <w:ilvl w:val="2"/>
+          <w:numId w:val="1"/>
+        </w:numPr>
+      </w:pPr>
+      <w:r>
+        <w:t xml:space="preserve">Checkbox, if checked the local web </w:t>
+      </w:r>
       <w:proofErr w:type="spellStart"/>
       <w:r>
-        <w:t>aaaaa</w:t>
+        <w:t>url</w:t>
       </w:r>
       <w:proofErr w:type="spellEnd"/>
-    </w:p>
-    <w:p>
-      <w:pPr>
-        <w:pStyle w:val="ListParagraph"/>
-        <w:numPr>
-          <w:ilvl w:val="1"/>
-          <w:numId w:val="1"/>
-        </w:numPr>
+      <w:r>
+        <w:t xml:space="preserve"> will start with https like “https://localhost:2015”, else it will be http like </w:t>
+      </w:r>
+      <w:r>
+        <w:t>“http://localhost:2015”</w:t>
+      </w:r>
+      <w:r>
+        <w:t>.</w:t>
+      </w:r>
+    </w:p>
+    <w:p>
+      <w:pPr>
+        <w:pStyle w:val="ListParagraph"/>
+        <w:numPr>
+          <w:ilvl w:val="2"/>
+          <w:numId w:val="1"/>
+        </w:numPr>
+      </w:pPr>
+      <w:r>
+        <w:t>Checkbox “Enable container support”</w:t>
+      </w:r>
+    </w:p>
+    <w:p>
+      <w:pPr>
+        <w:pStyle w:val="ListParagraph"/>
+        <w:numPr>
+          <w:ilvl w:val="3"/>
+          <w:numId w:val="1"/>
+        </w:numPr>
+      </w:pPr>
+      <w:r>
+        <w:t>Leave unchecked for now.  We will be doing this later when learning docker in Azure.</w:t>
+      </w:r>
+    </w:p>
+    <w:p>
+      <w:pPr>
+        <w:pStyle w:val="ListParagraph"/>
+        <w:numPr>
+          <w:ilvl w:val="2"/>
+          <w:numId w:val="1"/>
+        </w:numPr>
+      </w:pPr>
+      <w:r>
+        <w:t>Make sure all settings below container support are unchecked.</w:t>
+      </w:r>
+    </w:p>
+    <w:p>
+      <w:pPr>
+        <w:pStyle w:val="ListParagraph"/>
+        <w:ind w:left="1440"/>
       </w:pPr>
       <w:r>
         <w:rPr>
           <w:noProof/>
         </w:rPr>
-        <w:lastRenderedPageBreak/>
         <w:drawing>
           <wp:inline distT="0" distB="0" distL="0" distR="0" wp14:anchorId="68C0F91C" wp14:editId="4E21A174">
             <wp:extent cx="5943600" cy="3808730"/>
@@ -2093,7 +2750,7 @@
                     </pic:cNvPicPr>
                   </pic:nvPicPr>
                   <pic:blipFill>
-                    <a:blip r:embed="rId13"/>
+                    <a:blip r:embed="rId14"/>
                     <a:stretch>
                       <a:fillRect/>
                     </a:stretch>
@@ -2118,30 +2775,103 @@
     <w:p>
       <w:pPr>
         <w:pStyle w:val="ListParagraph"/>
+        <w:ind w:left="1440"/>
+      </w:pPr>
+    </w:p>
+    <w:p>
+      <w:pPr>
+        <w:pStyle w:val="ListParagraph"/>
+        <w:ind w:left="1440"/>
+      </w:pPr>
+    </w:p>
+    <w:p>
+      <w:pPr>
+        <w:pStyle w:val="ListParagraph"/>
+        <w:ind w:left="1440"/>
+      </w:pPr>
+    </w:p>
+    <w:p>
+      <w:pPr>
+        <w:pStyle w:val="ListParagraph"/>
+        <w:ind w:left="1440"/>
+      </w:pPr>
+    </w:p>
+    <w:p>
+      <w:pPr>
+        <w:pStyle w:val="ListParagraph"/>
+        <w:ind w:left="1440"/>
+      </w:pPr>
+    </w:p>
+    <w:p>
+      <w:pPr>
+        <w:pStyle w:val="ListParagraph"/>
         <w:numPr>
           <w:ilvl w:val="1"/>
           <w:numId w:val="1"/>
         </w:numPr>
       </w:pPr>
-      <w:proofErr w:type="spellStart"/>
-      <w:r>
-        <w:t>Aaa</w:t>
-      </w:r>
-      <w:proofErr w:type="spellEnd"/>
-    </w:p>
-    <w:p>
-      <w:pPr>
-        <w:pStyle w:val="ListParagraph"/>
-        <w:numPr>
-          <w:ilvl w:val="1"/>
-          <w:numId w:val="1"/>
-        </w:numPr>
+      <w:r>
+        <w:lastRenderedPageBreak/>
+        <w:t>Solution Explorer</w:t>
+      </w:r>
+    </w:p>
+    <w:p>
+      <w:pPr>
+        <w:pStyle w:val="ListParagraph"/>
+        <w:numPr>
+          <w:ilvl w:val="2"/>
+          <w:numId w:val="1"/>
+        </w:numPr>
+      </w:pPr>
+      <w:r>
+        <w:t xml:space="preserve">Now that our project is created, we can see the file and folder structure here. File extensions are hidden but the other parts of the file name </w:t>
+      </w:r>
+      <w:proofErr w:type="gramStart"/>
+      <w:r>
+        <w:t>shows</w:t>
+      </w:r>
+      <w:proofErr w:type="gramEnd"/>
+      <w:r>
+        <w:t>.</w:t>
+      </w:r>
+    </w:p>
+    <w:p>
+      <w:pPr>
+        <w:pStyle w:val="ListParagraph"/>
+        <w:numPr>
+          <w:ilvl w:val="2"/>
+          <w:numId w:val="1"/>
+        </w:numPr>
+      </w:pPr>
+      <w:r>
+        <w:t xml:space="preserve">Only one solution file.  It manages </w:t>
+      </w:r>
+      <w:proofErr w:type="gramStart"/>
+      <w:r>
+        <w:t>all of</w:t>
+      </w:r>
+      <w:proofErr w:type="gramEnd"/>
+      <w:r>
+        <w:t xml:space="preserve"> the other project files.  It also decides which </w:t>
+      </w:r>
+      <w:proofErr w:type="gramStart"/>
+      <w:r>
+        <w:t>top level</w:t>
+      </w:r>
+      <w:proofErr w:type="gramEnd"/>
+      <w:r>
+        <w:t xml:space="preserve"> project is the one that will run.  You can have two or three website projects.  The solution will point to the one that will be run currently.</w:t>
+      </w:r>
+    </w:p>
+    <w:p>
+      <w:pPr>
+        <w:pStyle w:val="ListParagraph"/>
+        <w:ind w:left="1440"/>
       </w:pPr>
       <w:r>
         <w:rPr>
           <w:noProof/>
         </w:rPr>
-        <w:lastRenderedPageBreak/>
         <w:drawing>
           <wp:inline distT="0" distB="0" distL="0" distR="0" wp14:anchorId="7B3BC9C3" wp14:editId="3FB829E3">
             <wp:extent cx="4610735" cy="5086985"/>
@@ -2160,7 +2890,7 @@
                     </pic:cNvPicPr>
                   </pic:nvPicPr>
                   <pic:blipFill>
-                    <a:blip r:embed="rId14"/>
+                    <a:blip r:embed="rId15"/>
                     <a:stretch>
                       <a:fillRect/>
                     </a:stretch>
@@ -2185,6 +2915,12 @@
     <w:p>
       <w:pPr>
         <w:pStyle w:val="ListParagraph"/>
+        <w:ind w:left="1440"/>
+      </w:pPr>
+    </w:p>
+    <w:p>
+      <w:pPr>
+        <w:pStyle w:val="ListParagraph"/>
         <w:numPr>
           <w:ilvl w:val="1"/>
           <w:numId w:val="1"/>
@@ -2192,7 +2928,7 @@
       </w:pPr>
       <w:proofErr w:type="spellStart"/>
       <w:r>
-        <w:t>Gggggg</w:t>
+        <w:t>asdf</w:t>
       </w:r>
       <w:proofErr w:type="spellEnd"/>
     </w:p>
@@ -2200,9 +2936,115 @@
       <w:pPr>
         <w:pStyle w:val="ListParagraph"/>
         <w:numPr>
+          <w:ilvl w:val="0"/>
+          <w:numId w:val="1"/>
+        </w:numPr>
+      </w:pPr>
+      <w:r>
+        <w:t>Running the project</w:t>
+      </w:r>
+    </w:p>
+    <w:p>
+      <w:pPr>
+        <w:pStyle w:val="ListParagraph"/>
+        <w:numPr>
           <w:ilvl w:val="1"/>
           <w:numId w:val="1"/>
         </w:numPr>
+      </w:pPr>
+      <w:r>
+        <w:t xml:space="preserve">Projects run in two modes. </w:t>
+      </w:r>
+    </w:p>
+    <w:p>
+      <w:pPr>
+        <w:pStyle w:val="ListParagraph"/>
+        <w:numPr>
+          <w:ilvl w:val="2"/>
+          <w:numId w:val="1"/>
+        </w:numPr>
+      </w:pPr>
+      <w:r>
+        <w:t xml:space="preserve">Debug build </w:t>
+      </w:r>
+    </w:p>
+    <w:p>
+      <w:pPr>
+        <w:pStyle w:val="ListParagraph"/>
+        <w:numPr>
+          <w:ilvl w:val="3"/>
+          <w:numId w:val="1"/>
+        </w:numPr>
+      </w:pPr>
+      <w:proofErr w:type="gramStart"/>
+      <w:r>
+        <w:lastRenderedPageBreak/>
+        <w:t>Adds</w:t>
+      </w:r>
+      <w:proofErr w:type="gramEnd"/>
+      <w:r>
+        <w:t xml:space="preserve"> hidden places to freeze running code to examine and fix it.  Meant to run locally for programming, NOT FOR SERVER USE FOR PRODUCTION OR EMPLOYEE TESTER</w:t>
+      </w:r>
+      <w:r>
+        <w:t>/MANAGEMENT</w:t>
+      </w:r>
+      <w:r>
+        <w:t xml:space="preserve"> EVALUATION.</w:t>
+      </w:r>
+    </w:p>
+    <w:p>
+      <w:pPr>
+        <w:pStyle w:val="ListParagraph"/>
+        <w:numPr>
+          <w:ilvl w:val="2"/>
+          <w:numId w:val="1"/>
+        </w:numPr>
+      </w:pPr>
+      <w:r>
+        <w:t xml:space="preserve">Release build </w:t>
+      </w:r>
+    </w:p>
+    <w:p>
+      <w:pPr>
+        <w:pStyle w:val="ListParagraph"/>
+        <w:numPr>
+          <w:ilvl w:val="3"/>
+          <w:numId w:val="1"/>
+        </w:numPr>
+      </w:pPr>
+      <w:r>
+        <w:t xml:space="preserve">This has no debug freeze points and runs faster, but we cannot freeze running code to find problems.  This is </w:t>
+      </w:r>
+      <w:r>
+        <w:rPr>
+          <w:b/>
+          <w:bCs/>
+        </w:rPr>
+        <w:t>meant for server use for production</w:t>
+      </w:r>
+      <w:r>
+        <w:t xml:space="preserve"> and for </w:t>
+      </w:r>
+      <w:r>
+        <w:t>employee tester/manager/public evaluation.</w:t>
+      </w:r>
+    </w:p>
+    <w:p>
+      <w:pPr>
+        <w:pStyle w:val="ListParagraph"/>
+        <w:numPr>
+          <w:ilvl w:val="2"/>
+          <w:numId w:val="1"/>
+        </w:numPr>
+      </w:pPr>
+      <w:r>
+        <w:t>Click solid arrow to run website in debug build using debugger local web server.</w:t>
+      </w:r>
+    </w:p>
+    <w:p>
+      <w:pPr>
+        <w:pStyle w:val="ListParagraph"/>
+        <w:ind w:left="1440"/>
       </w:pPr>
       <w:r>
         <w:rPr>
@@ -2226,7 +3068,7 @@
                     </pic:cNvPicPr>
                   </pic:nvPicPr>
                   <pic:blipFill>
-                    <a:blip r:embed="rId15"/>
+                    <a:blip r:embed="rId16"/>
                     <a:stretch>
                       <a:fillRect/>
                     </a:stretch>
@@ -2251,14 +3093,85 @@
     <w:p>
       <w:pPr>
         <w:pStyle w:val="ListParagraph"/>
+        <w:ind w:left="1440"/>
+      </w:pPr>
+    </w:p>
+    <w:p>
+      <w:pPr>
+        <w:pStyle w:val="ListParagraph"/>
         <w:numPr>
           <w:ilvl w:val="1"/>
           <w:numId w:val="1"/>
         </w:numPr>
       </w:pPr>
       <w:r>
-        <w:t>Deploy to Azure, quick deploy</w:t>
-      </w:r>
+        <w:t>The running site is shown below in a browser resized to show all parts.</w:t>
+      </w:r>
+    </w:p>
+    <w:p>
+      <w:pPr>
+        <w:pStyle w:val="ListParagraph"/>
+        <w:ind w:left="1440"/>
+      </w:pPr>
+      <w:r>
+        <w:rPr>
+          <w:noProof/>
+        </w:rPr>
+        <w:drawing>
+          <wp:inline distT="0" distB="0" distL="0" distR="0" wp14:anchorId="7C06FAF4" wp14:editId="7FD2F230">
+            <wp:extent cx="2943225" cy="2190750"/>
+            <wp:effectExtent l="0" t="0" r="9525" b="0"/>
+            <wp:docPr id="2085136277" name="Picture 4"/>
+            <wp:cNvGraphicFramePr>
+              <a:graphicFrameLocks xmlns:a="http://schemas.openxmlformats.org/drawingml/2006/main" noChangeAspect="1"/>
+            </wp:cNvGraphicFramePr>
+            <a:graphic xmlns:a="http://schemas.openxmlformats.org/drawingml/2006/main">
+              <a:graphicData uri="http://schemas.openxmlformats.org/drawingml/2006/picture">
+                <pic:pic xmlns:pic="http://schemas.openxmlformats.org/drawingml/2006/picture">
+                  <pic:nvPicPr>
+                    <pic:cNvPr id="0" name="Picture 1"/>
+                    <pic:cNvPicPr>
+                      <a:picLocks noChangeAspect="1" noChangeArrowheads="1"/>
+                    </pic:cNvPicPr>
+                  </pic:nvPicPr>
+                  <pic:blipFill>
+                    <a:blip r:embed="rId17">
+                      <a:extLst>
+                        <a:ext uri="{28A0092B-C50C-407E-A947-70E740481C1C}">
+                          <a14:useLocalDpi xmlns:a14="http://schemas.microsoft.com/office/drawing/2010/main" val="0"/>
+                        </a:ext>
+                      </a:extLst>
+                    </a:blip>
+                    <a:srcRect/>
+                    <a:stretch>
+                      <a:fillRect/>
+                    </a:stretch>
+                  </pic:blipFill>
+                  <pic:spPr bwMode="auto">
+                    <a:xfrm>
+                      <a:off x="0" y="0"/>
+                      <a:ext cx="2943225" cy="2190750"/>
+                    </a:xfrm>
+                    <a:prstGeom prst="rect">
+                      <a:avLst/>
+                    </a:prstGeom>
+                    <a:noFill/>
+                    <a:ln>
+                      <a:noFill/>
+                    </a:ln>
+                  </pic:spPr>
+                </pic:pic>
+              </a:graphicData>
+            </a:graphic>
+          </wp:inline>
+        </w:drawing>
+      </w:r>
+    </w:p>
+    <w:p>
+      <w:pPr>
+        <w:pStyle w:val="ListParagraph"/>
+        <w:ind w:left="1440"/>
+      </w:pPr>
     </w:p>
     <w:p>
       <w:pPr>
@@ -2267,6 +3180,97 @@
           <w:ilvl w:val="1"/>
           <w:numId w:val="1"/>
         </w:numPr>
+      </w:pPr>
+      <w:r>
+        <w:t>Close the browser tab or click red box in Visual Studio to stop web site running locally.</w:t>
+      </w:r>
+    </w:p>
+    <w:p>
+      <w:pPr>
+        <w:pStyle w:val="ListParagraph"/>
+        <w:ind w:left="1440"/>
+      </w:pPr>
+    </w:p>
+    <w:p>
+      <w:pPr>
+        <w:pStyle w:val="ListParagraph"/>
+        <w:numPr>
+          <w:ilvl w:val="0"/>
+          <w:numId w:val="1"/>
+        </w:numPr>
+      </w:pPr>
+      <w:r>
+        <w:t xml:space="preserve">VISUAL STUDIO Quick </w:t>
+      </w:r>
+      <w:r>
+        <w:t>Deploy to Azure</w:t>
+      </w:r>
+    </w:p>
+    <w:p>
+      <w:pPr>
+        <w:pStyle w:val="ListParagraph"/>
+        <w:numPr>
+          <w:ilvl w:val="1"/>
+          <w:numId w:val="1"/>
+        </w:numPr>
+      </w:pPr>
+      <w:r>
+        <w:t xml:space="preserve">In Solution </w:t>
+      </w:r>
+      <w:proofErr w:type="gramStart"/>
+      <w:r>
+        <w:t>Explorer right</w:t>
+      </w:r>
+      <w:proofErr w:type="gramEnd"/>
+      <w:r>
+        <w:t xml:space="preserve"> click on a PROJECT FILE</w:t>
+      </w:r>
+    </w:p>
+    <w:p>
+      <w:pPr>
+        <w:pStyle w:val="ListParagraph"/>
+        <w:numPr>
+          <w:ilvl w:val="1"/>
+          <w:numId w:val="1"/>
+        </w:numPr>
+      </w:pPr>
+      <w:r>
+        <w:t xml:space="preserve">You will be presented with a </w:t>
+      </w:r>
+      <w:proofErr w:type="gramStart"/>
+      <w:r>
+        <w:t>pop up</w:t>
+      </w:r>
+      <w:proofErr w:type="gramEnd"/>
+      <w:r>
+        <w:t xml:space="preserve"> context menu.</w:t>
+      </w:r>
+    </w:p>
+    <w:p>
+      <w:pPr>
+        <w:pStyle w:val="ListParagraph"/>
+        <w:numPr>
+          <w:ilvl w:val="1"/>
+          <w:numId w:val="1"/>
+        </w:numPr>
+      </w:pPr>
+      <w:r>
+        <w:t xml:space="preserve">Choose the </w:t>
+      </w:r>
+      <w:r>
+        <w:t>PUBLISH option.</w:t>
+      </w:r>
+    </w:p>
+    <w:p>
+      <w:pPr>
+        <w:pStyle w:val="ListParagraph"/>
+        <w:ind w:left="1440"/>
+      </w:pPr>
+    </w:p>
+    <w:p>
+      <w:pPr>
+        <w:pStyle w:val="ListParagraph"/>
+        <w:ind w:left="1440"/>
       </w:pPr>
       <w:r>
         <w:rPr>
@@ -2291,7 +3295,7 @@
                     </pic:cNvPicPr>
                   </pic:nvPicPr>
                   <pic:blipFill>
-                    <a:blip r:embed="rId16"/>
+                    <a:blip r:embed="rId18"/>
                     <a:stretch>
                       <a:fillRect/>
                     </a:stretch>
@@ -2316,16 +3320,32 @@
     <w:p>
       <w:pPr>
         <w:pStyle w:val="ListParagraph"/>
+        <w:ind w:left="1440"/>
+      </w:pPr>
+    </w:p>
+    <w:p>
+      <w:pPr>
+        <w:pStyle w:val="ListParagraph"/>
         <w:numPr>
           <w:ilvl w:val="1"/>
           <w:numId w:val="1"/>
         </w:numPr>
       </w:pPr>
-      <w:proofErr w:type="spellStart"/>
-      <w:r>
-        <w:t>Asdf</w:t>
-      </w:r>
-      <w:proofErr w:type="spellEnd"/>
+      <w:r>
+        <w:t>Publish profile content window</w:t>
+      </w:r>
+    </w:p>
+    <w:p>
+      <w:pPr>
+        <w:pStyle w:val="ListParagraph"/>
+        <w:numPr>
+          <w:ilvl w:val="2"/>
+          <w:numId w:val="1"/>
+        </w:numPr>
+      </w:pPr>
+      <w:r>
+        <w:t>This window is designed for you to save deployment settings to your different Azure items you want to update (e.g. website, web service, Azure Functions, and more).  Put another way, this pushes updated code to app service, virtual machines, azure functions, and a dozen different azure items you can program and deploy.</w:t>
+      </w:r>
     </w:p>
     <w:p>
       <w:pPr>
@@ -2355,7 +3375,7 @@
                     </pic:cNvPicPr>
                   </pic:nvPicPr>
                   <pic:blipFill>
-                    <a:blip r:embed="rId17"/>
+                    <a:blip r:embed="rId19"/>
                     <a:stretch>
                       <a:fillRect/>
                     </a:stretch>
@@ -2385,11 +3405,9 @@
           <w:numId w:val="1"/>
         </w:numPr>
       </w:pPr>
-      <w:proofErr w:type="spellStart"/>
-      <w:r>
-        <w:t>Ddd</w:t>
-      </w:r>
-      <w:proofErr w:type="spellEnd"/>
+      <w:r>
+        <w:t>We have no profiles yet, so click the link circled to create our first profile.</w:t>
+      </w:r>
     </w:p>
     <w:p>
       <w:pPr>
@@ -2398,6 +3416,60 @@
           <w:ilvl w:val="1"/>
           <w:numId w:val="1"/>
         </w:numPr>
+      </w:pPr>
+      <w:r>
+        <w:t xml:space="preserve">Visual Studio can publish </w:t>
+      </w:r>
+      <w:proofErr w:type="gramStart"/>
+      <w:r>
+        <w:t>to</w:t>
+      </w:r>
+      <w:proofErr w:type="gramEnd"/>
+      <w:r>
+        <w:t xml:space="preserve"> many things, only one of which is Azure Portal.</w:t>
+      </w:r>
+    </w:p>
+    <w:p>
+      <w:pPr>
+        <w:pStyle w:val="ListParagraph"/>
+        <w:numPr>
+          <w:ilvl w:val="1"/>
+          <w:numId w:val="1"/>
+        </w:numPr>
+      </w:pPr>
+      <w:r>
+        <w:t xml:space="preserve">Select Azure portal from the list as shown </w:t>
+      </w:r>
+      <w:proofErr w:type="gramStart"/>
+      <w:r>
+        <w:t>below, and</w:t>
+      </w:r>
+      <w:proofErr w:type="gramEnd"/>
+      <w:r>
+        <w:t xml:space="preserve"> click NEXT.</w:t>
+      </w:r>
+    </w:p>
+    <w:p>
+      <w:pPr>
+        <w:pStyle w:val="ListParagraph"/>
+        <w:ind w:left="1440"/>
+      </w:pPr>
+    </w:p>
+    <w:p>
+      <w:pPr>
+        <w:pStyle w:val="ListParagraph"/>
+        <w:ind w:left="1440"/>
+      </w:pPr>
+    </w:p>
+    <w:p>
+      <w:pPr>
+        <w:pStyle w:val="ListParagraph"/>
+      </w:pPr>
+    </w:p>
+    <w:p>
+      <w:pPr>
+        <w:pStyle w:val="ListParagraph"/>
+        <w:ind w:left="1440"/>
       </w:pPr>
       <w:r>
         <w:rPr>
@@ -2405,9 +3477,17 @@
         </w:rPr>
         <w:lastRenderedPageBreak/>
         <w:drawing>
-          <wp:inline distT="0" distB="0" distL="0" distR="0" wp14:anchorId="4E63754D" wp14:editId="5897F392">
+          <wp:anchor distT="0" distB="0" distL="114300" distR="114300" simplePos="0" relativeHeight="251659264" behindDoc="0" locked="0" layoutInCell="1" allowOverlap="1" wp14:anchorId="4E63754D" wp14:editId="7A6A9365">
+            <wp:simplePos x="0" y="0"/>
+            <wp:positionH relativeFrom="column">
+              <wp:posOffset>914400</wp:posOffset>
+            </wp:positionH>
+            <wp:positionV relativeFrom="paragraph">
+              <wp:posOffset>219075</wp:posOffset>
+            </wp:positionV>
             <wp:extent cx="5943600" cy="4351020"/>
             <wp:effectExtent l="0" t="0" r="0" b="0"/>
+            <wp:wrapTopAndBottom/>
             <wp:docPr id="27" name="Image21"/>
             <wp:cNvGraphicFramePr>
               <a:graphicFrameLocks xmlns:a="http://schemas.openxmlformats.org/drawingml/2006/main" noChangeAspect="1"/>
@@ -2422,7 +3502,13 @@
                     </pic:cNvPicPr>
                   </pic:nvPicPr>
                   <pic:blipFill>
-                    <a:blip r:embed="rId18"/>
+                    <a:blip r:embed="rId20">
+                      <a:extLst>
+                        <a:ext uri="{28A0092B-C50C-407E-A947-70E740481C1C}">
+                          <a14:useLocalDpi xmlns:a14="http://schemas.microsoft.com/office/drawing/2010/main" val="0"/>
+                        </a:ext>
+                      </a:extLst>
+                    </a:blip>
                     <a:stretch>
                       <a:fillRect/>
                     </a:stretch>
@@ -2440,25 +3526,154 @@
                 </pic:pic>
               </a:graphicData>
             </a:graphic>
-          </wp:inline>
+          </wp:anchor>
         </w:drawing>
       </w:r>
     </w:p>
     <w:p>
       <w:pPr>
         <w:pStyle w:val="ListParagraph"/>
+        <w:ind w:left="1440"/>
+      </w:pPr>
+    </w:p>
+    <w:p>
+      <w:pPr>
+        <w:pStyle w:val="ListParagraph"/>
+        <w:ind w:left="1440"/>
+      </w:pPr>
+    </w:p>
+    <w:p>
+      <w:pPr>
+        <w:pStyle w:val="ListParagraph"/>
+        <w:ind w:left="1440"/>
+      </w:pPr>
+    </w:p>
+    <w:p>
+      <w:pPr>
+        <w:pStyle w:val="ListParagraph"/>
+        <w:ind w:left="1440"/>
+      </w:pPr>
+    </w:p>
+    <w:p>
+      <w:pPr>
+        <w:pStyle w:val="ListParagraph"/>
+        <w:ind w:left="1440"/>
+      </w:pPr>
+    </w:p>
+    <w:p>
+      <w:pPr>
+        <w:pStyle w:val="ListParagraph"/>
+        <w:ind w:left="1440"/>
+      </w:pPr>
+    </w:p>
+    <w:p>
+      <w:pPr>
+        <w:pStyle w:val="ListParagraph"/>
+        <w:ind w:left="1440"/>
+      </w:pPr>
+    </w:p>
+    <w:p>
+      <w:pPr>
+        <w:pStyle w:val="ListParagraph"/>
+        <w:ind w:left="1440"/>
+      </w:pPr>
+    </w:p>
+    <w:p>
+      <w:pPr>
+        <w:pStyle w:val="ListParagraph"/>
+        <w:ind w:left="1440"/>
+      </w:pPr>
+    </w:p>
+    <w:p>
+      <w:pPr>
+        <w:pStyle w:val="ListParagraph"/>
+        <w:ind w:left="1440"/>
+      </w:pPr>
+    </w:p>
+    <w:p>
+      <w:pPr>
+        <w:pStyle w:val="ListParagraph"/>
+        <w:ind w:left="1440"/>
+      </w:pPr>
+    </w:p>
+    <w:p>
+      <w:pPr>
+        <w:pStyle w:val="ListParagraph"/>
+        <w:ind w:left="1440"/>
+      </w:pPr>
+    </w:p>
+    <w:p>
+      <w:pPr>
+        <w:pStyle w:val="ListParagraph"/>
+        <w:ind w:left="1440"/>
+      </w:pPr>
+    </w:p>
+    <w:p>
+      <w:pPr>
+        <w:pStyle w:val="ListParagraph"/>
+        <w:ind w:left="1440"/>
+      </w:pPr>
+    </w:p>
+    <w:p>
+      <w:pPr>
+        <w:pStyle w:val="ListParagraph"/>
+        <w:ind w:left="1440"/>
+      </w:pPr>
+    </w:p>
+    <w:p>
+      <w:pPr>
+        <w:pStyle w:val="ListParagraph"/>
+        <w:ind w:left="1440"/>
+      </w:pPr>
+    </w:p>
+    <w:p>
+      <w:pPr>
+        <w:pStyle w:val="ListParagraph"/>
+        <w:ind w:left="1440"/>
+      </w:pPr>
+    </w:p>
+    <w:p>
+      <w:pPr>
+        <w:pStyle w:val="ListParagraph"/>
         <w:numPr>
           <w:ilvl w:val="1"/>
           <w:numId w:val="1"/>
         </w:numPr>
       </w:pPr>
       <w:r>
+        <w:lastRenderedPageBreak/>
+        <w:t>Now we choose which Azure Service we are going to push to.</w:t>
+      </w:r>
+    </w:p>
+    <w:p>
+      <w:pPr>
+        <w:pStyle w:val="ListParagraph"/>
+        <w:numPr>
+          <w:ilvl w:val="1"/>
+          <w:numId w:val="1"/>
+        </w:numPr>
+      </w:pPr>
+      <w:r>
+        <w:t>App Service is a folder on a virtual machine.  I chose to push to a folder on a Linux machine.</w:t>
+      </w:r>
+      <w:r>
+        <w:t xml:space="preserve">  </w:t>
+      </w:r>
+      <w:r>
+        <w:t>Click next for next wizard page.</w:t>
+      </w:r>
+    </w:p>
+    <w:p>
+      <w:pPr>
+        <w:pStyle w:val="ListParagraph"/>
+        <w:ind w:left="1440"/>
+      </w:pPr>
+      <w:r>
         <w:rPr>
           <w:noProof/>
         </w:rPr>
-        <w:lastRenderedPageBreak/>
         <w:drawing>
-          <wp:inline distT="0" distB="0" distL="0" distR="0" wp14:anchorId="586817C2" wp14:editId="2C6440A6">
+          <wp:inline distT="0" distB="0" distL="0" distR="0" wp14:anchorId="2DFA1540" wp14:editId="43277E35">
             <wp:extent cx="5943600" cy="4178935"/>
             <wp:effectExtent l="0" t="0" r="0" b="0"/>
             <wp:docPr id="28" name="Image22"/>
@@ -2475,7 +3690,7 @@
                     </pic:cNvPicPr>
                   </pic:nvPicPr>
                   <pic:blipFill>
-                    <a:blip r:embed="rId19"/>
+                    <a:blip r:embed="rId21"/>
                     <a:stretch>
                       <a:fillRect/>
                     </a:stretch>
@@ -2500,16 +3715,265 @@
     <w:p>
       <w:pPr>
         <w:pStyle w:val="ListParagraph"/>
+        <w:ind w:left="1440"/>
+      </w:pPr>
+    </w:p>
+    <w:p>
+      <w:pPr>
+        <w:pStyle w:val="ListParagraph"/>
+        <w:ind w:left="1440"/>
+      </w:pPr>
+    </w:p>
+    <w:p>
+      <w:pPr>
+        <w:pStyle w:val="ListParagraph"/>
+        <w:ind w:left="1440"/>
+      </w:pPr>
+    </w:p>
+    <w:p>
+      <w:pPr>
+        <w:pStyle w:val="ListParagraph"/>
+        <w:ind w:left="1440"/>
+      </w:pPr>
+    </w:p>
+    <w:p>
+      <w:pPr>
+        <w:pStyle w:val="ListParagraph"/>
+        <w:ind w:left="1440"/>
+      </w:pPr>
+    </w:p>
+    <w:p>
+      <w:pPr>
+        <w:pStyle w:val="ListParagraph"/>
+        <w:ind w:left="1440"/>
+      </w:pPr>
+    </w:p>
+    <w:p>
+      <w:pPr>
+        <w:pStyle w:val="ListParagraph"/>
+        <w:ind w:left="1440"/>
+      </w:pPr>
+    </w:p>
+    <w:p>
+      <w:pPr>
+        <w:pStyle w:val="ListParagraph"/>
+        <w:ind w:left="1440"/>
+      </w:pPr>
+    </w:p>
+    <w:p>
+      <w:pPr>
+        <w:pStyle w:val="ListParagraph"/>
+        <w:ind w:left="1440"/>
+      </w:pPr>
+    </w:p>
+    <w:p>
+      <w:pPr>
+        <w:pStyle w:val="ListParagraph"/>
+        <w:ind w:left="1440"/>
+      </w:pPr>
+    </w:p>
+    <w:p>
+      <w:pPr>
+        <w:pStyle w:val="ListParagraph"/>
+        <w:ind w:left="1440"/>
+      </w:pPr>
+    </w:p>
+    <w:p>
+      <w:pPr>
+        <w:pStyle w:val="ListParagraph"/>
+        <w:ind w:left="1440"/>
+      </w:pPr>
+    </w:p>
+    <w:p>
+      <w:pPr>
+        <w:pStyle w:val="ListParagraph"/>
+        <w:ind w:left="1440"/>
+      </w:pPr>
+    </w:p>
+    <w:p>
+      <w:pPr>
+        <w:pStyle w:val="ListParagraph"/>
+        <w:ind w:left="1440"/>
+      </w:pPr>
+    </w:p>
+    <w:p>
+      <w:pPr>
+        <w:pStyle w:val="ListParagraph"/>
+        <w:ind w:left="1440"/>
+      </w:pPr>
+    </w:p>
+    <w:p>
+      <w:pPr>
+        <w:pStyle w:val="ListParagraph"/>
         <w:numPr>
           <w:ilvl w:val="1"/>
           <w:numId w:val="1"/>
         </w:numPr>
       </w:pPr>
-      <w:proofErr w:type="spellStart"/>
-      <w:r>
-        <w:t>Asd</w:t>
-      </w:r>
-      <w:proofErr w:type="spellEnd"/>
+    </w:p>
+    <w:p>
+      <w:pPr>
+        <w:pStyle w:val="ListParagraph"/>
+        <w:numPr>
+          <w:ilvl w:val="1"/>
+          <w:numId w:val="1"/>
+        </w:numPr>
+      </w:pPr>
+      <w:r>
+        <w:t>Hosting plans in Azure</w:t>
+      </w:r>
+    </w:p>
+    <w:p>
+      <w:pPr>
+        <w:pStyle w:val="ListParagraph"/>
+        <w:numPr>
+          <w:ilvl w:val="2"/>
+          <w:numId w:val="1"/>
+        </w:numPr>
+      </w:pPr>
+      <w:r>
+        <w:t xml:space="preserve">Hosting plans get </w:t>
+      </w:r>
+      <w:proofErr w:type="gramStart"/>
+      <w:r>
+        <w:t>names</w:t>
+      </w:r>
+      <w:proofErr w:type="gramEnd"/>
+      <w:r>
+        <w:t xml:space="preserve"> but they are a group of settings.</w:t>
+      </w:r>
+    </w:p>
+    <w:p>
+      <w:pPr>
+        <w:pStyle w:val="ListParagraph"/>
+        <w:numPr>
+          <w:ilvl w:val="2"/>
+          <w:numId w:val="1"/>
+        </w:numPr>
+      </w:pPr>
+      <w:r>
+        <w:t xml:space="preserve">A suggested name is provided that is unique.  You can change this </w:t>
+      </w:r>
+      <w:proofErr w:type="gramStart"/>
+      <w:r>
+        <w:t>a you</w:t>
+      </w:r>
+      <w:proofErr w:type="gramEnd"/>
+      <w:r>
+        <w:t xml:space="preserve"> wish but the name must be unique.</w:t>
+      </w:r>
+    </w:p>
+    <w:p>
+      <w:pPr>
+        <w:pStyle w:val="ListParagraph"/>
+        <w:numPr>
+          <w:ilvl w:val="2"/>
+          <w:numId w:val="1"/>
+        </w:numPr>
+      </w:pPr>
+      <w:r>
+        <w:t xml:space="preserve">Microsoft has data centers around the world.  </w:t>
+      </w:r>
+    </w:p>
+    <w:p>
+      <w:pPr>
+        <w:pStyle w:val="ListParagraph"/>
+        <w:numPr>
+          <w:ilvl w:val="2"/>
+          <w:numId w:val="1"/>
+        </w:numPr>
+      </w:pPr>
+      <w:r>
+        <w:t xml:space="preserve">Choose one by region in the </w:t>
+      </w:r>
+      <w:proofErr w:type="gramStart"/>
+      <w:r>
+        <w:t>drop down</w:t>
+      </w:r>
+      <w:proofErr w:type="gramEnd"/>
+      <w:r>
+        <w:t xml:space="preserve"> menu.  This has 2 considerations:</w:t>
+      </w:r>
+    </w:p>
+    <w:p>
+      <w:pPr>
+        <w:pStyle w:val="ListParagraph"/>
+        <w:numPr>
+          <w:ilvl w:val="3"/>
+          <w:numId w:val="1"/>
+        </w:numPr>
+      </w:pPr>
+      <w:r>
+        <w:t>Closeness to your customers for a faster response.  This is usually negligible, unless you are a larger company and site.</w:t>
+      </w:r>
+    </w:p>
+    <w:p>
+      <w:pPr>
+        <w:pStyle w:val="ListParagraph"/>
+        <w:numPr>
+          <w:ilvl w:val="3"/>
+          <w:numId w:val="1"/>
+        </w:numPr>
+      </w:pPr>
+      <w:r>
+        <w:t>The hardware strength.  Some data centers are more mature with more options than others.  There are no limits or validations from the Microsoft side for this consideration.</w:t>
+      </w:r>
+    </w:p>
+    <w:p>
+      <w:pPr>
+        <w:pStyle w:val="ListParagraph"/>
+        <w:numPr>
+          <w:ilvl w:val="2"/>
+          <w:numId w:val="1"/>
+        </w:numPr>
+      </w:pPr>
+      <w:r>
+        <w:t>Size</w:t>
+      </w:r>
+    </w:p>
+    <w:p>
+      <w:pPr>
+        <w:pStyle w:val="ListParagraph"/>
+        <w:numPr>
+          <w:ilvl w:val="3"/>
+          <w:numId w:val="1"/>
+        </w:numPr>
+      </w:pPr>
+      <w:r>
+        <w:t>This is the MAJOR consideration for the customer and admin.  Your folder is located on a virtual machine, and you are promised processor strength and RAM space based on your choice here.</w:t>
+      </w:r>
+    </w:p>
+    <w:p>
+      <w:pPr>
+        <w:pStyle w:val="ListParagraph"/>
+        <w:numPr>
+          <w:ilvl w:val="3"/>
+          <w:numId w:val="1"/>
+        </w:numPr>
+      </w:pPr>
+      <w:r>
+        <w:t xml:space="preserve">For simplicity they rate their servers with a letter followed by a number.  B1 is lowest level for BASIC tier.  </w:t>
+      </w:r>
+    </w:p>
+    <w:p>
+      <w:pPr>
+        <w:pStyle w:val="ListParagraph"/>
+        <w:numPr>
+          <w:ilvl w:val="3"/>
+          <w:numId w:val="1"/>
+        </w:numPr>
+      </w:pPr>
+      <w:r>
+        <w:t xml:space="preserve">The weakest are free, but they don’t expose that in your Visual Studio dropdown meu.  They are hoping to be able to charge you a modest fee to help them out by your ignorance here.  F1 is lowest level and usually </w:t>
+      </w:r>
+      <w:proofErr w:type="gramStart"/>
+      <w:r>
+        <w:t>only item in</w:t>
+      </w:r>
+      <w:proofErr w:type="gramEnd"/>
+      <w:r>
+        <w:t xml:space="preserve"> FREE TIER.</w:t>
+      </w:r>
     </w:p>
     <w:p>
       <w:pPr>
@@ -2532,9 +3996,9 @@
         </w:rPr>
         <w:lastRenderedPageBreak/>
         <w:drawing>
-          <wp:inline distT="0" distB="0" distL="0" distR="0" wp14:anchorId="2F6720D4" wp14:editId="451E7031">
-            <wp:extent cx="5943600" cy="7033260"/>
-            <wp:effectExtent l="0" t="0" r="0" b="0"/>
+          <wp:inline distT="0" distB="0" distL="0" distR="0" wp14:anchorId="2F6720D4" wp14:editId="1EE63F3A">
+            <wp:extent cx="4343400" cy="5139690"/>
+            <wp:effectExtent l="0" t="0" r="0" b="3810"/>
             <wp:docPr id="1141848040" name="Picture 4"/>
             <wp:cNvGraphicFramePr>
               <a:graphicFrameLocks xmlns:a="http://schemas.openxmlformats.org/drawingml/2006/main" noChangeAspect="1"/>
@@ -2549,7 +4013,7 @@
                     </pic:cNvPicPr>
                   </pic:nvPicPr>
                   <pic:blipFill>
-                    <a:blip r:embed="rId20">
+                    <a:blip r:embed="rId22">
                       <a:extLst>
                         <a:ext uri="{28A0092B-C50C-407E-A947-70E740481C1C}">
                           <a14:useLocalDpi xmlns:a14="http://schemas.microsoft.com/office/drawing/2010/main" val="0"/>
@@ -2564,7 +4028,7 @@
                   <pic:spPr bwMode="auto">
                     <a:xfrm>
                       <a:off x="0" y="0"/>
-                      <a:ext cx="5943600" cy="7033260"/>
+                      <a:ext cx="4347650" cy="5144719"/>
                     </a:xfrm>
                     <a:prstGeom prst="rect">
                       <a:avLst/>
@@ -2584,24 +4048,126 @@
     <w:p>
       <w:pPr>
         <w:pStyle w:val="ListParagraph"/>
+        <w:ind w:left="1440"/>
+      </w:pPr>
+    </w:p>
+    <w:p>
+      <w:pPr>
+        <w:pStyle w:val="ListParagraph"/>
+        <w:ind w:left="1440"/>
+      </w:pPr>
+    </w:p>
+    <w:p>
+      <w:pPr>
+        <w:pStyle w:val="ListParagraph"/>
+        <w:ind w:left="1440"/>
+      </w:pPr>
+    </w:p>
+    <w:p>
+      <w:pPr>
+        <w:pStyle w:val="ListParagraph"/>
+        <w:ind w:left="1440"/>
+      </w:pPr>
+    </w:p>
+    <w:p>
+      <w:pPr>
+        <w:pStyle w:val="ListParagraph"/>
+        <w:ind w:left="1440"/>
+      </w:pPr>
+    </w:p>
+    <w:p>
+      <w:pPr>
+        <w:pStyle w:val="ListParagraph"/>
+        <w:ind w:left="1440"/>
+      </w:pPr>
+    </w:p>
+    <w:p>
+      <w:pPr>
+        <w:pStyle w:val="ListParagraph"/>
+        <w:ind w:left="1440"/>
+      </w:pPr>
+    </w:p>
+    <w:p>
+      <w:pPr>
+        <w:pStyle w:val="ListParagraph"/>
+        <w:ind w:left="1440"/>
+      </w:pPr>
+    </w:p>
+    <w:p>
+      <w:pPr>
+        <w:pStyle w:val="ListParagraph"/>
+        <w:ind w:left="1440"/>
+      </w:pPr>
+    </w:p>
+    <w:p>
+      <w:pPr>
+        <w:pStyle w:val="ListParagraph"/>
+        <w:ind w:left="1440"/>
+      </w:pPr>
+    </w:p>
+    <w:p>
+      <w:pPr>
+        <w:pStyle w:val="ListParagraph"/>
+        <w:ind w:left="1440"/>
+      </w:pPr>
+    </w:p>
+    <w:p>
+      <w:pPr>
+        <w:pStyle w:val="ListParagraph"/>
+        <w:ind w:left="1440"/>
+      </w:pPr>
+    </w:p>
+    <w:p>
+      <w:pPr>
+        <w:pStyle w:val="ListParagraph"/>
+        <w:ind w:left="1440"/>
+      </w:pPr>
+    </w:p>
+    <w:p>
+      <w:pPr>
+        <w:pStyle w:val="ListParagraph"/>
+        <w:ind w:left="1440"/>
+      </w:pPr>
+    </w:p>
+    <w:p>
+      <w:pPr>
+        <w:pStyle w:val="ListParagraph"/>
         <w:numPr>
           <w:ilvl w:val="1"/>
           <w:numId w:val="1"/>
         </w:numPr>
       </w:pPr>
-      <w:proofErr w:type="spellStart"/>
-      <w:r>
-        <w:t>asdf</w:t>
-      </w:r>
-      <w:proofErr w:type="spellEnd"/>
-    </w:p>
-    <w:p>
-      <w:pPr>
-        <w:pStyle w:val="ListParagraph"/>
-        <w:numPr>
-          <w:ilvl w:val="0"/>
-          <w:numId w:val="1"/>
-        </w:numPr>
+      <w:r>
+        <w:lastRenderedPageBreak/>
+        <w:t xml:space="preserve">This is a screen shot of SIZE expanded.  Notice the </w:t>
+      </w:r>
+      <w:r>
+        <w:t xml:space="preserve">processor core and RAM strengths gradually </w:t>
+      </w:r>
+      <w:proofErr w:type="gramStart"/>
+      <w:r>
+        <w:t>increase</w:t>
+      </w:r>
+      <w:proofErr w:type="gramEnd"/>
+      <w:r>
+        <w:t xml:space="preserve"> and the letter tiers increase.  </w:t>
+      </w:r>
+    </w:p>
+    <w:p>
+      <w:pPr>
+        <w:pStyle w:val="ListParagraph"/>
+        <w:numPr>
+          <w:ilvl w:val="1"/>
+          <w:numId w:val="1"/>
+        </w:numPr>
+      </w:pPr>
+      <w:r>
+        <w:t>I will pull up Azure Portal to look at these same settings and get a better explanation and understanding for them.</w:t>
+      </w:r>
+    </w:p>
+    <w:p>
+      <w:pPr>
+        <w:pStyle w:val="ListParagraph"/>
         <w:suppressAutoHyphens w:val="0"/>
         <w:spacing w:before="100" w:beforeAutospacing="1" w:after="100" w:afterAutospacing="1" w:line="240" w:lineRule="auto"/>
         <w:rPr>
@@ -2614,7 +4180,6 @@
         <w:rPr>
           <w:noProof/>
         </w:rPr>
-        <w:lastRenderedPageBreak/>
         <w:drawing>
           <wp:inline distT="0" distB="0" distL="0" distR="0" wp14:anchorId="073F5CC3" wp14:editId="173B02AD">
             <wp:extent cx="5943600" cy="5821680"/>
@@ -2633,7 +4198,7 @@
                     </pic:cNvPicPr>
                   </pic:nvPicPr>
                   <pic:blipFill>
-                    <a:blip r:embed="rId21">
+                    <a:blip r:embed="rId23">
                       <a:extLst>
                         <a:ext uri="{28A0092B-C50C-407E-A947-70E740481C1C}">
                           <a14:useLocalDpi xmlns:a14="http://schemas.microsoft.com/office/drawing/2010/main" val="0"/>
@@ -2668,24 +4233,98 @@
     <w:p>
       <w:pPr>
         <w:pStyle w:val="ListParagraph"/>
+        <w:ind w:left="1440"/>
+      </w:pPr>
+    </w:p>
+    <w:p>
+      <w:pPr>
+        <w:pStyle w:val="ListParagraph"/>
+        <w:ind w:left="1440"/>
+      </w:pPr>
+    </w:p>
+    <w:p>
+      <w:pPr>
+        <w:pStyle w:val="ListParagraph"/>
+        <w:ind w:left="1440"/>
+      </w:pPr>
+    </w:p>
+    <w:p>
+      <w:pPr>
+        <w:pStyle w:val="ListParagraph"/>
+        <w:ind w:left="1440"/>
+      </w:pPr>
+    </w:p>
+    <w:p>
+      <w:pPr>
+        <w:pStyle w:val="ListParagraph"/>
+        <w:ind w:left="1440"/>
+      </w:pPr>
+    </w:p>
+    <w:p>
+      <w:pPr>
+        <w:pStyle w:val="ListParagraph"/>
+        <w:ind w:left="1440"/>
+      </w:pPr>
+    </w:p>
+    <w:p>
+      <w:pPr>
+        <w:pStyle w:val="ListParagraph"/>
+        <w:ind w:left="1440"/>
+      </w:pPr>
+    </w:p>
+    <w:p>
+      <w:pPr>
+        <w:pStyle w:val="ListParagraph"/>
+        <w:ind w:left="1440"/>
+      </w:pPr>
+    </w:p>
+    <w:p>
+      <w:pPr>
+        <w:pStyle w:val="ListParagraph"/>
         <w:numPr>
           <w:ilvl w:val="1"/>
           <w:numId w:val="1"/>
         </w:numPr>
       </w:pPr>
-      <w:proofErr w:type="spellStart"/>
-      <w:r>
-        <w:t>sadf</w:t>
-      </w:r>
-      <w:proofErr w:type="spellEnd"/>
-    </w:p>
-    <w:p>
-      <w:pPr>
-        <w:pStyle w:val="ListParagraph"/>
-        <w:numPr>
-          <w:ilvl w:val="0"/>
-          <w:numId w:val="1"/>
-        </w:numPr>
+      <w:r>
+        <w:t xml:space="preserve">Below I have gone into Azure Portal.  This is the first setup tab/page for a new app service using Linux OS.  Notice the </w:t>
+      </w:r>
+      <w:proofErr w:type="gramStart"/>
+      <w:r>
+        <w:t>F----FREE</w:t>
+      </w:r>
+      <w:proofErr w:type="gramEnd"/>
+      <w:r>
+        <w:t xml:space="preserve"> Tier marked in green highlight</w:t>
+      </w:r>
+    </w:p>
+    <w:p>
+      <w:pPr>
+        <w:pStyle w:val="ListParagraph"/>
+        <w:numPr>
+          <w:ilvl w:val="1"/>
+          <w:numId w:val="1"/>
+        </w:numPr>
+      </w:pPr>
+      <w:r>
+        <w:t>The red marks the lowest tier offered to you in Visual Studio.</w:t>
+      </w:r>
+    </w:p>
+    <w:p>
+      <w:pPr>
+        <w:pStyle w:val="ListParagraph"/>
+        <w:numPr>
+          <w:ilvl w:val="1"/>
+          <w:numId w:val="1"/>
+        </w:numPr>
+      </w:pPr>
+      <w:r>
+        <w:t>Estimated costs are shown for what they expect traditional usage to cost you.</w:t>
+      </w:r>
+    </w:p>
+    <w:p>
+      <w:pPr>
+        <w:pStyle w:val="ListParagraph"/>
         <w:suppressAutoHyphens w:val="0"/>
         <w:spacing w:before="100" w:beforeAutospacing="1" w:after="100" w:afterAutospacing="1" w:line="240" w:lineRule="auto"/>
         <w:rPr>
@@ -2698,7 +4337,6 @@
         <w:rPr>
           <w:noProof/>
         </w:rPr>
-        <w:lastRenderedPageBreak/>
         <w:drawing>
           <wp:inline distT="0" distB="0" distL="0" distR="0" wp14:anchorId="00EF7FDE" wp14:editId="3316EF91">
             <wp:extent cx="5943600" cy="4153535"/>
@@ -2717,7 +4355,7 @@
                     </pic:cNvPicPr>
                   </pic:nvPicPr>
                   <pic:blipFill>
-                    <a:blip r:embed="rId22">
+                    <a:blip r:embed="rId24">
                       <a:extLst>
                         <a:ext uri="{28A0092B-C50C-407E-A947-70E740481C1C}">
                           <a14:useLocalDpi xmlns:a14="http://schemas.microsoft.com/office/drawing/2010/main" val="0"/>
@@ -2748,34 +4386,6 @@
           </wp:inline>
         </w:drawing>
       </w:r>
-    </w:p>
-    <w:p>
-      <w:pPr>
-        <w:pStyle w:val="ListParagraph"/>
-        <w:numPr>
-          <w:ilvl w:val="1"/>
-          <w:numId w:val="1"/>
-        </w:numPr>
-      </w:pPr>
-      <w:proofErr w:type="spellStart"/>
-      <w:r>
-        <w:t>asdf</w:t>
-      </w:r>
-      <w:proofErr w:type="spellEnd"/>
-    </w:p>
-    <w:p>
-      <w:pPr>
-        <w:pStyle w:val="ListParagraph"/>
-        <w:numPr>
-          <w:ilvl w:val="1"/>
-          <w:numId w:val="1"/>
-        </w:numPr>
-      </w:pPr>
-      <w:proofErr w:type="spellStart"/>
-      <w:r>
-        <w:t>asdf</w:t>
-      </w:r>
-      <w:proofErr w:type="spellEnd"/>
     </w:p>
     <w:p/>
     <w:p/>
@@ -4594,10 +6204,6 @@
 </file>
 
 <file path=customXml/item1.xml><?xml version="1.0" encoding="utf-8"?>
-<b:Sources xmlns:b="http://schemas.openxmlformats.org/officeDocument/2006/bibliography" xmlns="http://schemas.openxmlformats.org/officeDocument/2006/bibliography" SelectedStyle="\APASixthEditionOfficeOnline.xsl" StyleName="APA" Version="6"/>
-</file>
-
-<file path=customXml/item2.xml><?xml version="1.0" encoding="utf-8"?>
 <CoverPageProperties xmlns="http://schemas.microsoft.com/office/2006/coverPageProps">
   <PublishDate/>
   <Abstract/>
@@ -4608,18 +6214,22 @@
 </CoverPageProperties>
 </file>
 
+<file path=customXml/item2.xml><?xml version="1.0" encoding="utf-8"?>
+<b:Sources xmlns:b="http://schemas.openxmlformats.org/officeDocument/2006/bibliography" xmlns="http://schemas.openxmlformats.org/officeDocument/2006/bibliography" SelectedStyle="\APASixthEditionOfficeOnline.xsl" StyleName="APA" Version="6"/>
+</file>
+
 <file path=customXml/itemProps1.xml><?xml version="1.0" encoding="utf-8"?>
+<ds:datastoreItem xmlns:ds="http://schemas.openxmlformats.org/officeDocument/2006/customXml" ds:itemID="{B4916CE0-3DF7-4FAB-BE3A-FD188A23B4A4}">
+  <ds:schemaRefs>
+    <ds:schemaRef ds:uri="http://schemas.microsoft.com/office/2006/coverPageProps"/>
+  </ds:schemaRefs>
+</ds:datastoreItem>
+</file>
+
+<file path=customXml/itemProps2.xml><?xml version="1.0" encoding="utf-8"?>
 <ds:datastoreItem xmlns:ds="http://schemas.openxmlformats.org/officeDocument/2006/customXml" ds:itemID="{84C89F70-45B8-42F1-8F97-77BA113E199F}">
   <ds:schemaRefs>
     <ds:schemaRef ds:uri="http://schemas.openxmlformats.org/officeDocument/2006/bibliography"/>
   </ds:schemaRefs>
 </ds:datastoreItem>
-</file>
-
-<file path=customXml/itemProps2.xml><?xml version="1.0" encoding="utf-8"?>
-<ds:datastoreItem xmlns:ds="http://schemas.openxmlformats.org/officeDocument/2006/customXml" ds:itemID="{B4916CE0-3DF7-4FAB-BE3A-FD188A23B4A4}">
-  <ds:schemaRefs>
-    <ds:schemaRef ds:uri="http://schemas.microsoft.com/office/2006/coverPageProps"/>
-  </ds:schemaRefs>
-</ds:datastoreItem>
 </file>
</xml_diff>